<commit_message>
readme: point markers at the live system, not localhost
the quick start was the only entry point and it opened with localhost urls,
so nothing told a marker there is a deployed instance they can just click.
adds the live url and credentials up top, a six step tour that walks the
governance loop end to end, a map of which file does what, and a note on why
the dev compose has a :3000 and production does not.

also corrects the OR limitation - the recursive-descent parser handles OR and
parentheses, architecture.md and the RTM still said it did not.
</commit_message>
<xml_diff>
--- a/docs/docx/architecture.docx
+++ b/docs/docx/architecture.docx
@@ -1243,14 +1243,155 @@
         <w:spacing w:after="120"/>
       </w:pPr>
       <w:r>
+        <w:t xml:space="preserve">The grammar covers </w:t>
+      </w:r>
+      <w:r>
         <w:rPr>
-          <w:b/>
+          <w:rFonts w:ascii="Courier New" w:hAnsi="Courier New"/>
           <w:color w:val="1B3A6B"/>
+          <w:sz w:val="18"/>
         </w:rPr>
-        <w:t>Known limitation:</w:t>
-      </w:r>
-      <w:r>
-        <w:t xml:space="preserve"> </w:t>
+        <w:t>==</w:t>
+      </w:r>
+      <w:r>
+        <w:t xml:space="preserve">, </w:t>
+      </w:r>
+      <w:r>
+        <w:rPr>
+          <w:rFonts w:ascii="Courier New" w:hAnsi="Courier New"/>
+          <w:color w:val="1B3A6B"/>
+          <w:sz w:val="18"/>
+        </w:rPr>
+        <w:t>!=</w:t>
+      </w:r>
+      <w:r>
+        <w:t xml:space="preserve">, </w:t>
+      </w:r>
+      <w:r>
+        <w:rPr>
+          <w:rFonts w:ascii="Courier New" w:hAnsi="Courier New"/>
+          <w:color w:val="1B3A6B"/>
+          <w:sz w:val="18"/>
+        </w:rPr>
+        <w:t>&gt;</w:t>
+      </w:r>
+      <w:r>
+        <w:t xml:space="preserve">, </w:t>
+      </w:r>
+      <w:r>
+        <w:rPr>
+          <w:rFonts w:ascii="Courier New" w:hAnsi="Courier New"/>
+          <w:color w:val="1B3A6B"/>
+          <w:sz w:val="18"/>
+        </w:rPr>
+        <w:t>&lt;</w:t>
+      </w:r>
+      <w:r>
+        <w:t xml:space="preserve">, </w:t>
+      </w:r>
+      <w:r>
+        <w:rPr>
+          <w:rFonts w:ascii="Courier New" w:hAnsi="Courier New"/>
+          <w:color w:val="1B3A6B"/>
+          <w:sz w:val="18"/>
+        </w:rPr>
+        <w:t>&gt;=</w:t>
+      </w:r>
+      <w:r>
+        <w:t xml:space="preserve">, </w:t>
+      </w:r>
+      <w:r>
+        <w:rPr>
+          <w:rFonts w:ascii="Courier New" w:hAnsi="Courier New"/>
+          <w:color w:val="1B3A6B"/>
+          <w:sz w:val="18"/>
+        </w:rPr>
+        <w:t>&lt;=</w:t>
+      </w:r>
+      <w:r>
+        <w:t xml:space="preserve">, </w:t>
+      </w:r>
+      <w:r>
+        <w:rPr>
+          <w:rFonts w:ascii="Courier New" w:hAnsi="Courier New"/>
+          <w:color w:val="1B3A6B"/>
+          <w:sz w:val="18"/>
+        </w:rPr>
+        <w:t>IN</w:t>
+      </w:r>
+      <w:r>
+        <w:t xml:space="preserve">, </w:t>
+      </w:r>
+      <w:r>
+        <w:rPr>
+          <w:rFonts w:ascii="Courier New" w:hAnsi="Courier New"/>
+          <w:color w:val="1B3A6B"/>
+          <w:sz w:val="18"/>
+        </w:rPr>
+        <w:t>NOT IN</w:t>
+      </w:r>
+      <w:r>
+        <w:t xml:space="preserve">, </w:t>
+      </w:r>
+      <w:r>
+        <w:rPr>
+          <w:rFonts w:ascii="Courier New" w:hAnsi="Courier New"/>
+          <w:color w:val="1B3A6B"/>
+          <w:sz w:val="18"/>
+        </w:rPr>
+        <w:t>CONTAINS</w:t>
+      </w:r>
+      <w:r>
+        <w:t>,</w:t>
+      </w:r>
+    </w:p>
+    <w:p>
+      <w:pPr>
+        <w:spacing w:after="120"/>
+      </w:pPr>
+      <w:r>
+        <w:rPr>
+          <w:rFonts w:ascii="Courier New" w:hAnsi="Courier New"/>
+          <w:color w:val="1B3A6B"/>
+          <w:sz w:val="18"/>
+        </w:rPr>
+        <w:t>NOT CONTAINS</w:t>
+      </w:r>
+      <w:r>
+        <w:t xml:space="preserve">, </w:t>
+      </w:r>
+      <w:r>
+        <w:rPr>
+          <w:rFonts w:ascii="Courier New" w:hAnsi="Courier New"/>
+          <w:color w:val="1B3A6B"/>
+          <w:sz w:val="18"/>
+        </w:rPr>
+        <w:t>MATCHES</w:t>
+      </w:r>
+      <w:r>
+        <w:t xml:space="preserve">, </w:t>
+      </w:r>
+      <w:r>
+        <w:rPr>
+          <w:rFonts w:ascii="Courier New" w:hAnsi="Courier New"/>
+          <w:color w:val="1B3A6B"/>
+          <w:sz w:val="18"/>
+        </w:rPr>
+        <w:t>NOT MATCHES</w:t>
+      </w:r>
+      <w:r>
+        <w:t xml:space="preserve">, </w:t>
+      </w:r>
+      <w:r>
+        <w:rPr>
+          <w:rFonts w:ascii="Courier New" w:hAnsi="Courier New"/>
+          <w:color w:val="1B3A6B"/>
+          <w:sz w:val="18"/>
+        </w:rPr>
+        <w:t>AND</w:t>
+      </w:r>
+      <w:r>
+        <w:t xml:space="preserve">, </w:t>
       </w:r>
       <w:r>
         <w:rPr>
@@ -1261,7 +1402,72 @@
         <w:t>OR</w:t>
       </w:r>
       <w:r>
-        <w:t xml:space="preserve"> is not supported.</w:t>
+        <w:t xml:space="preserve">, </w:t>
+      </w:r>
+      <w:r>
+        <w:rPr>
+          <w:rFonts w:ascii="Courier New" w:hAnsi="Courier New"/>
+          <w:color w:val="1B3A6B"/>
+          <w:sz w:val="18"/>
+        </w:rPr>
+        <w:t>NOT</w:t>
+      </w:r>
+      <w:r>
+        <w:t xml:space="preserve"> and parentheses.</w:t>
+      </w:r>
+    </w:p>
+    <w:p>
+      <w:pPr>
+        <w:spacing w:after="120"/>
+      </w:pPr>
+      <w:r>
+        <w:rPr>
+          <w:rFonts w:ascii="Courier New" w:hAnsi="Courier New"/>
+          <w:color w:val="1B3A6B"/>
+          <w:sz w:val="18"/>
+        </w:rPr>
+        <w:t>OR</w:t>
+      </w:r>
+      <w:r>
+        <w:t xml:space="preserve"> was genuinely missing at one point and this document said so; the</w:t>
+      </w:r>
+    </w:p>
+    <w:p>
+      <w:pPr>
+        <w:spacing w:after="120"/>
+      </w:pPr>
+      <w:r>
+        <w:t xml:space="preserve">recursive-descent parser in </w:t>
+      </w:r>
+      <w:r>
+        <w:rPr>
+          <w:rFonts w:ascii="Courier New" w:hAnsi="Courier New"/>
+          <w:color w:val="1B3A6B"/>
+          <w:sz w:val="18"/>
+        </w:rPr>
+        <w:t>backend/services/condition_parser.py</w:t>
+      </w:r>
+      <w:r>
+        <w:t xml:space="preserve"> supports it,</w:t>
+      </w:r>
+    </w:p>
+    <w:p>
+      <w:pPr>
+        <w:spacing w:after="120"/>
+      </w:pPr>
+      <w:r>
+        <w:t xml:space="preserve">verified by the cases in </w:t>
+      </w:r>
+      <w:r>
+        <w:rPr>
+          <w:rFonts w:ascii="Courier New" w:hAnsi="Courier New"/>
+          <w:color w:val="1B3A6B"/>
+          <w:sz w:val="18"/>
+        </w:rPr>
+        <w:t>tests/backend/test_condition_parser.py</w:t>
+      </w:r>
+      <w:r>
+        <w:t>.</w:t>
       </w:r>
     </w:p>
     <w:p>

</xml_diff>

<commit_message>
readme: document how to test through the agent path
adds the intercept curl examples a marker can run, explains the two
integration paths (wrapper hooks and the langchain handler) and why the
governed agent lives outside this repo.

the agent console address stays out - it executes tool calls on a host and
its token rides in a query string, so it goes to the supervisor directly.
azure-deployment.md claimed basic auth was in front of it; it is not, so
that is now written up as an open gap rather than a fixed one.
</commit_message>
<xml_diff>
--- a/docs/docx/architecture.docx
+++ b/docs/docx/architecture.docx
@@ -512,6 +512,496 @@
       </w:pPr>
       <w:r>
         <w:t>against the SPA catch-all.</w:t>
+      </w:r>
+    </w:p>
+    <w:p>
+      <w:r>
+        <w:rPr>
+          <w:b/>
+          <w:color w:val="1B3A6B"/>
+          <w:sz w:val="22"/>
+        </w:rPr>
+        <w:t>The agent side</w:t>
+      </w:r>
+    </w:p>
+    <w:p>
+      <w:pPr>
+        <w:spacing w:after="120"/>
+      </w:pPr>
+      <w:r>
+        <w:t>Certacito governs an agent that lives outside this repository. That separation is</w:t>
+      </w:r>
+    </w:p>
+    <w:p>
+      <w:pPr>
+        <w:spacing w:after="120"/>
+      </w:pPr>
+      <w:r>
+        <w:t>the design, not an omission: the governance layer holds the policy, the audit</w:t>
+      </w:r>
+    </w:p>
+    <w:p>
+      <w:pPr>
+        <w:spacing w:after="120"/>
+      </w:pPr>
+      <w:r>
+        <w:t>chain and the human workflow, and stays independent of whichever agent framework</w:t>
+      </w:r>
+    </w:p>
+    <w:p>
+      <w:pPr>
+        <w:spacing w:after="120"/>
+      </w:pPr>
+      <w:r>
+        <w:t xml:space="preserve">is in front of it. Three callers exercise the same </w:t>
+      </w:r>
+      <w:r>
+        <w:rPr>
+          <w:rFonts w:ascii="Courier New" w:hAnsi="Courier New"/>
+          <w:color w:val="1B3A6B"/>
+          <w:sz w:val="18"/>
+        </w:rPr>
+        <w:t>/api/v1/intercept</w:t>
+      </w:r>
+      <w:r>
+        <w:t xml:space="preserve"> contract.</w:t>
+      </w:r>
+    </w:p>
+    <w:tbl>
+      <w:tblPr>
+        <w:tblStyle w:val="TableGrid"/>
+        <w:tblW w:type="auto" w:w="0"/>
+        <w:jc w:val="center"/>
+        <w:tblLook w:firstColumn="1" w:firstRow="1" w:lastColumn="0" w:lastRow="0" w:noHBand="0" w:noVBand="1" w:val="04A0"/>
+      </w:tblPr>
+      <w:tblGrid>
+        <w:gridCol w:w="3552"/>
+        <w:gridCol w:w="3552"/>
+        <w:gridCol w:w="3552"/>
+      </w:tblGrid>
+      <w:tr>
+        <w:tc>
+          <w:tcPr>
+            <w:tcW w:type="dxa" w:w="3552"/>
+            <w:shd w:val="clear" w:fill="1B3A6B"/>
+          </w:tcPr>
+          <w:p>
+            <w:r/>
+            <w:r>
+              <w:rPr>
+                <w:b/>
+                <w:color w:val="FFFFFF"/>
+                <w:sz w:val="15"/>
+              </w:rPr>
+              <w:t>CALLER</w:t>
+            </w:r>
+          </w:p>
+        </w:tc>
+        <w:tc>
+          <w:tcPr>
+            <w:tcW w:type="dxa" w:w="3552"/>
+            <w:shd w:val="clear" w:fill="1B3A6B"/>
+          </w:tcPr>
+          <w:p>
+            <w:r/>
+            <w:r>
+              <w:rPr>
+                <w:b/>
+                <w:color w:val="FFFFFF"/>
+                <w:sz w:val="15"/>
+              </w:rPr>
+              <w:t>HOW IT INTEGRATES</w:t>
+            </w:r>
+          </w:p>
+        </w:tc>
+        <w:tc>
+          <w:tcPr>
+            <w:tcW w:type="dxa" w:w="3552"/>
+            <w:shd w:val="clear" w:fill="1B3A6B"/>
+          </w:tcPr>
+          <w:p>
+            <w:r/>
+            <w:r>
+              <w:rPr>
+                <w:b/>
+                <w:color w:val="FFFFFF"/>
+                <w:sz w:val="15"/>
+              </w:rPr>
+              <w:t>WHERE</w:t>
+            </w:r>
+          </w:p>
+        </w:tc>
+      </w:tr>
+      <w:tr>
+        <w:tc>
+          <w:tcPr>
+            <w:tcW w:type="dxa" w:w="3552"/>
+          </w:tcPr>
+          <w:p>
+            <w:pPr>
+              <w:spacing w:after="20"/>
+            </w:pPr>
+            <w:r>
+              <w:rPr>
+                <w:sz w:val="16"/>
+              </w:rPr>
+            </w:r>
+            <w:r>
+              <w:rPr>
+                <w:sz w:val="16"/>
+              </w:rPr>
+              <w:t>OpenClaw (</w:t>
+            </w:r>
+            <w:r>
+              <w:rPr>
+                <w:rFonts w:ascii="Courier New" w:hAnsi="Courier New"/>
+                <w:color w:val="1B3A6B"/>
+                <w:sz w:val="16"/>
+              </w:rPr>
+              <w:t>claude-cli</w:t>
+            </w:r>
+            <w:r>
+              <w:rPr>
+                <w:sz w:val="16"/>
+              </w:rPr>
+              <w:t xml:space="preserve"> runtime)</w:t>
+            </w:r>
+          </w:p>
+        </w:tc>
+        <w:tc>
+          <w:tcPr>
+            <w:tcW w:type="dxa" w:w="3552"/>
+          </w:tcPr>
+          <w:p>
+            <w:pPr>
+              <w:spacing w:after="20"/>
+            </w:pPr>
+            <w:r>
+              <w:rPr>
+                <w:sz w:val="16"/>
+              </w:rPr>
+            </w:r>
+            <w:r>
+              <w:rPr>
+                <w:sz w:val="16"/>
+              </w:rPr>
+              <w:t xml:space="preserve">Shell wrappers per tool, plus an exec gate for arbitrary commands. Each POSTs to </w:t>
+            </w:r>
+            <w:r>
+              <w:rPr>
+                <w:rFonts w:ascii="Courier New" w:hAnsi="Courier New"/>
+                <w:color w:val="1B3A6B"/>
+                <w:sz w:val="16"/>
+              </w:rPr>
+              <w:t>/intercept</w:t>
+            </w:r>
+            <w:r>
+              <w:rPr>
+                <w:sz w:val="16"/>
+              </w:rPr>
+              <w:t xml:space="preserve"> and refuses to run unless the outcome is PERMIT.</w:t>
+            </w:r>
+          </w:p>
+        </w:tc>
+        <w:tc>
+          <w:tcPr>
+            <w:tcW w:type="dxa" w:w="3552"/>
+          </w:tcPr>
+          <w:p>
+            <w:pPr>
+              <w:spacing w:after="20"/>
+            </w:pPr>
+            <w:r>
+              <w:rPr>
+                <w:sz w:val="16"/>
+              </w:rPr>
+            </w:r>
+            <w:r>
+              <w:rPr>
+                <w:sz w:val="16"/>
+              </w:rPr>
+              <w:t>Deployed alongside the agent, not in this repo</w:t>
+            </w:r>
+          </w:p>
+        </w:tc>
+      </w:tr>
+      <w:tr>
+        <w:tc>
+          <w:tcPr>
+            <w:tcW w:type="dxa" w:w="3552"/>
+            <w:shd w:val="clear" w:fill="F7F9FC"/>
+          </w:tcPr>
+          <w:p>
+            <w:pPr>
+              <w:spacing w:after="20"/>
+            </w:pPr>
+            <w:r>
+              <w:rPr>
+                <w:sz w:val="16"/>
+              </w:rPr>
+            </w:r>
+            <w:r>
+              <w:rPr>
+                <w:sz w:val="16"/>
+              </w:rPr>
+              <w:t>LangChain agents</w:t>
+            </w:r>
+          </w:p>
+        </w:tc>
+        <w:tc>
+          <w:tcPr>
+            <w:tcW w:type="dxa" w:w="3552"/>
+            <w:shd w:val="clear" w:fill="F7F9FC"/>
+          </w:tcPr>
+          <w:p>
+            <w:pPr>
+              <w:spacing w:after="20"/>
+            </w:pPr>
+            <w:r>
+              <w:rPr>
+                <w:sz w:val="16"/>
+              </w:rPr>
+            </w:r>
+            <w:r>
+              <w:rPr>
+                <w:rFonts w:ascii="Courier New" w:hAnsi="Courier New"/>
+                <w:color w:val="1B3A6B"/>
+                <w:sz w:val="16"/>
+              </w:rPr>
+              <w:t>CertacitoGovernanceHandler.check_tool_call()</w:t>
+            </w:r>
+            <w:r>
+              <w:rPr>
+                <w:sz w:val="16"/>
+              </w:rPr>
+              <w:t xml:space="preserve"> maps a tool call to an action type and returns a </w:t>
+            </w:r>
+            <w:r>
+              <w:rPr>
+                <w:rFonts w:ascii="Courier New" w:hAnsi="Courier New"/>
+                <w:color w:val="1B3A6B"/>
+                <w:sz w:val="16"/>
+              </w:rPr>
+              <w:t>GovernanceDecision</w:t>
+            </w:r>
+            <w:r>
+              <w:rPr>
+                <w:sz w:val="16"/>
+              </w:rPr>
+              <w:t>. Sync and async.</w:t>
+            </w:r>
+          </w:p>
+        </w:tc>
+        <w:tc>
+          <w:tcPr>
+            <w:tcW w:type="dxa" w:w="3552"/>
+            <w:shd w:val="clear" w:fill="F7F9FC"/>
+          </w:tcPr>
+          <w:p>
+            <w:pPr>
+              <w:spacing w:after="20"/>
+            </w:pPr>
+            <w:r>
+              <w:rPr>
+                <w:sz w:val="16"/>
+              </w:rPr>
+            </w:r>
+            <w:r>
+              <w:rPr>
+                <w:rFonts w:ascii="Courier New" w:hAnsi="Courier New"/>
+                <w:color w:val="1B3A6B"/>
+                <w:sz w:val="16"/>
+              </w:rPr>
+              <w:t>backend/agents/langchain_interceptor.py</w:t>
+            </w:r>
+          </w:p>
+        </w:tc>
+      </w:tr>
+      <w:tr>
+        <w:tc>
+          <w:tcPr>
+            <w:tcW w:type="dxa" w:w="3552"/>
+          </w:tcPr>
+          <w:p>
+            <w:pPr>
+              <w:spacing w:after="20"/>
+            </w:pPr>
+            <w:r>
+              <w:rPr>
+                <w:sz w:val="16"/>
+              </w:rPr>
+            </w:r>
+            <w:r>
+              <w:rPr>
+                <w:sz w:val="16"/>
+              </w:rPr>
+              <w:t>Traffic simulator</w:t>
+            </w:r>
+          </w:p>
+        </w:tc>
+        <w:tc>
+          <w:tcPr>
+            <w:tcW w:type="dxa" w:w="3552"/>
+          </w:tcPr>
+          <w:p>
+            <w:pPr>
+              <w:spacing w:after="20"/>
+            </w:pPr>
+            <w:r>
+              <w:rPr>
+                <w:sz w:val="16"/>
+              </w:rPr>
+            </w:r>
+            <w:r>
+              <w:rPr>
+                <w:sz w:val="16"/>
+              </w:rPr>
+              <w:t>Posts synthetic decisions under invented agent ids for demonstration.</w:t>
+            </w:r>
+          </w:p>
+        </w:tc>
+        <w:tc>
+          <w:tcPr>
+            <w:tcW w:type="dxa" w:w="3552"/>
+          </w:tcPr>
+          <w:p>
+            <w:pPr>
+              <w:spacing w:after="20"/>
+            </w:pPr>
+            <w:r>
+              <w:rPr>
+                <w:sz w:val="16"/>
+              </w:rPr>
+            </w:r>
+            <w:r>
+              <w:rPr>
+                <w:rFonts w:ascii="Courier New" w:hAnsi="Courier New"/>
+                <w:color w:val="1B3A6B"/>
+                <w:sz w:val="16"/>
+              </w:rPr>
+              <w:t>backend/services/simulator.py</w:t>
+            </w:r>
+          </w:p>
+        </w:tc>
+      </w:tr>
+    </w:tbl>
+    <w:p/>
+    <w:p>
+      <w:pPr>
+        <w:spacing w:after="120"/>
+      </w:pPr>
+      <w:r>
+        <w:t>Two properties matter more than the integration mechanics:</w:t>
+      </w:r>
+    </w:p>
+    <w:p>
+      <w:pPr>
+        <w:pStyle w:val="ListBullet"/>
+        <w:spacing w:after="40"/>
+      </w:pPr>
+      <w:r>
+        <w:rPr>
+          <w:b/>
+          <w:color w:val="1B3A6B"/>
+        </w:rPr>
+        <w:t>The agent cannot opt out.</w:t>
+      </w:r>
+      <w:r>
+        <w:t xml:space="preserve"> The wrapper is the only path to the underlying</w:t>
+      </w:r>
+    </w:p>
+    <w:p>
+      <w:pPr>
+        <w:spacing w:after="120"/>
+      </w:pPr>
+      <w:r>
+        <w:t xml:space="preserve">  command, so bypassing governance means not running the tool at all.</w:t>
+      </w:r>
+    </w:p>
+    <w:p>
+      <w:pPr>
+        <w:pStyle w:val="ListBullet"/>
+        <w:spacing w:after="40"/>
+      </w:pPr>
+      <w:r>
+        <w:rPr>
+          <w:b/>
+          <w:color w:val="1B3A6B"/>
+        </w:rPr>
+        <w:t>Unreachable means denied.</w:t>
+      </w:r>
+      <w:r>
+        <w:t xml:space="preserve"> If the API cannot be reached, the wrapper and the</w:t>
+      </w:r>
+    </w:p>
+    <w:p>
+      <w:pPr>
+        <w:spacing w:after="120"/>
+      </w:pPr>
+      <w:r>
+        <w:t xml:space="preserve">  LangChain handler both return DENY (rule </w:t>
+      </w:r>
+      <w:r>
+        <w:rPr>
+          <w:rFonts w:ascii="Courier New" w:hAnsi="Courier New"/>
+          <w:color w:val="1B3A6B"/>
+          <w:sz w:val="18"/>
+        </w:rPr>
+        <w:t>FAILSAFE</w:t>
+      </w:r>
+      <w:r>
+        <w:t>). Taking Certacito offline</w:t>
+      </w:r>
+    </w:p>
+    <w:p>
+      <w:pPr>
+        <w:spacing w:after="120"/>
+      </w:pPr>
+      <w:r>
+        <w:t xml:space="preserve">  stops the agent rather than freeing it, which is the opposite of how a</w:t>
+      </w:r>
+    </w:p>
+    <w:p>
+      <w:pPr>
+        <w:spacing w:after="120"/>
+      </w:pPr>
+      <w:r>
+        <w:t xml:space="preserve">  monitoring system behaves and is the point of the design.</w:t>
+      </w:r>
+    </w:p>
+    <w:p>
+      <w:pPr>
+        <w:spacing w:after="120"/>
+      </w:pPr>
+      <w:r>
+        <w:t xml:space="preserve">Agents authenticate with </w:t>
+      </w:r>
+      <w:r>
+        <w:rPr>
+          <w:rFonts w:ascii="Courier New" w:hAnsi="Courier New"/>
+          <w:color w:val="1B3A6B"/>
+          <w:sz w:val="18"/>
+        </w:rPr>
+        <w:t>X-API-Key</w:t>
+      </w:r>
+      <w:r>
+        <w:t xml:space="preserve"> rather than a JWT, since there is no</w:t>
+      </w:r>
+    </w:p>
+    <w:p>
+      <w:pPr>
+        <w:spacing w:after="120"/>
+      </w:pPr>
+      <w:r>
+        <w:t>interactive login to perform. Unregistered agent ids are still evaluated and</w:t>
+      </w:r>
+    </w:p>
+    <w:p>
+      <w:pPr>
+        <w:spacing w:after="120"/>
+      </w:pPr>
+      <w:r>
+        <w:t>still audited; they simply do not appear in the registry.</w:t>
       </w:r>
     </w:p>
     <w:p>

</xml_diff>

<commit_message>
docs: live agent evidence in the sprint report, drop the stale OR gap, correct when the login bug was found
</commit_message>
<xml_diff>
--- a/docs/docx/architecture.docx
+++ b/docs/docx/architecture.docx
@@ -3709,26 +3709,6 @@
       </w:pPr>
       <w:r>
         <w:t>architectural rather than feature-level:</w:t>
-      </w:r>
-    </w:p>
-    <w:p>
-      <w:pPr>
-        <w:pStyle w:val="ListBullet"/>
-        <w:spacing w:after="40"/>
-      </w:pPr>
-      <w:r>
-        <w:t xml:space="preserve">Policy conditions do not support </w:t>
-      </w:r>
-      <w:r>
-        <w:rPr>
-          <w:rFonts w:ascii="Courier New" w:hAnsi="Courier New"/>
-          <w:color w:val="1B3A6B"/>
-          <w:sz w:val="18"/>
-        </w:rPr>
-        <w:t>OR</w:t>
-      </w:r>
-      <w:r>
-        <w:t xml:space="preserve"> (FR-02).</w:t>
       </w:r>
     </w:p>
     <w:p>

</xml_diff>

<commit_message>
docs: sequence, deployment and component diagrams, embed the ERD, reconcile the TLS story, split the amber and gold roles
</commit_message>
<xml_diff>
--- a/docs/docx/architecture.docx
+++ b/docs/docx/architecture.docx
@@ -375,6 +375,90 @@
       </w:pPr>
       <w:r>
         <w:t>Polling exists only as a fallback if the socket cannot connect.</w:t>
+      </w:r>
+    </w:p>
+    <w:p>
+      <w:pPr>
+        <w:spacing w:before="280"/>
+      </w:pPr>
+      <w:r>
+        <w:rPr>
+          <w:b/>
+          <w:color w:val="1B3A6B"/>
+          <w:sz w:val="26"/>
+        </w:rPr>
+        <w:t>The interception path, step by step</w:t>
+      </w:r>
+    </w:p>
+    <w:p>
+      <w:pPr>
+        <w:spacing w:after="120"/>
+      </w:pPr>
+      <w:r>
+        <w:t xml:space="preserve">The core governance decision, traced from </w:t>
+      </w:r>
+      <w:r>
+        <w:rPr>
+          <w:rFonts w:ascii="Courier New" w:hAnsi="Courier New"/>
+          <w:color w:val="1B3A6B"/>
+          <w:sz w:val="18"/>
+        </w:rPr>
+        <w:t>backend/api/interception.py</w:t>
+      </w:r>
+      <w:r>
+        <w:t>. Note</w:t>
+      </w:r>
+    </w:p>
+    <w:p>
+      <w:pPr>
+        <w:spacing w:after="120"/>
+      </w:pPr>
+      <w:r>
+        <w:t>the three separate DENY branches: the semantic guard short-circuits before the</w:t>
+      </w:r>
+    </w:p>
+    <w:p>
+      <w:pPr>
+        <w:spacing w:after="120"/>
+      </w:pPr>
+      <w:r>
+        <w:t>policy engine runs, an engine exception denies, and no matching rule denies.</w:t>
+      </w:r>
+    </w:p>
+    <w:p>
+      <w:r>
+        <w:drawing>
+          <wp:inline xmlns:a="http://schemas.openxmlformats.org/drawingml/2006/main" xmlns:pic="http://schemas.openxmlformats.org/drawingml/2006/picture">
+            <wp:extent cx="5852160" cy="4385219"/>
+            <wp:docPr id="2" name="Picture 2"/>
+            <wp:cNvGraphicFramePr>
+              <a:graphicFrameLocks noChangeAspect="1"/>
+            </wp:cNvGraphicFramePr>
+            <a:graphic>
+              <a:graphicData uri="http://schemas.openxmlformats.org/drawingml/2006/picture">
+                <pic:pic>
+                  <pic:nvPicPr>
+                    <pic:cNvPr id="0" name="diagram-sequence-intercept.png"/>
+                    <pic:cNvPicPr/>
+                  </pic:nvPicPr>
+                  <pic:blipFill>
+                    <a:blip r:embed="rId11"/>
+                    <a:stretch>
+                      <a:fillRect/>
+                    </a:stretch>
+                  </pic:blipFill>
+                  <pic:spPr>
+                    <a:xfrm>
+                      <a:off x="0" y="0"/>
+                      <a:ext cx="5852160" cy="4385219"/>
+                    </a:xfrm>
+                    <a:prstGeom prst="rect"/>
+                  </pic:spPr>
+                </pic:pic>
+              </a:graphicData>
+            </a:graphic>
+          </wp:inline>
+        </w:drawing>
       </w:r>
     </w:p>
     <w:p>
@@ -2645,26 +2729,7 @@
         <w:t>backend/models/tables.py</w:t>
       </w:r>
       <w:r>
-        <w:t xml:space="preserve">: </w:t>
-      </w:r>
-      <w:r>
-        <w:rPr>
-          <w:rFonts w:ascii="Courier New" w:hAnsi="Courier New"/>
-          <w:color w:val="1B3A6B"/>
-          <w:sz w:val="18"/>
-        </w:rPr>
-        <w:t>docs/screenshots/database-erd.png</w:t>
-      </w:r>
-      <w:r>
-        <w:t xml:space="preserve"> (mermaid source</w:t>
-      </w:r>
-    </w:p>
-    <w:p>
-      <w:pPr>
-        <w:spacing w:after="120"/>
-      </w:pPr>
-      <w:r>
-        <w:t xml:space="preserve">in </w:t>
+        <w:t xml:space="preserve"> (mermaid source in </w:t>
       </w:r>
       <w:r>
         <w:rPr>
@@ -2675,7 +2740,59 @@
         <w:t>docs/database-erd.html</w:t>
       </w:r>
       <w:r>
-        <w:t>).</w:t>
+        <w:t>). Dashed</w:t>
+      </w:r>
+    </w:p>
+    <w:p>
+      <w:pPr>
+        <w:spacing w:after="120"/>
+      </w:pPr>
+      <w:r>
+        <w:t>lines are logical relationships that the database does not enforce, explained</w:t>
+      </w:r>
+    </w:p>
+    <w:p>
+      <w:pPr>
+        <w:spacing w:after="120"/>
+      </w:pPr>
+      <w:r>
+        <w:t>directly below:</w:t>
+      </w:r>
+    </w:p>
+    <w:p>
+      <w:r>
+        <w:drawing>
+          <wp:inline xmlns:a="http://schemas.openxmlformats.org/drawingml/2006/main" xmlns:pic="http://schemas.openxmlformats.org/drawingml/2006/picture">
+            <wp:extent cx="5852160" cy="3214787"/>
+            <wp:docPr id="3" name="Picture 3"/>
+            <wp:cNvGraphicFramePr>
+              <a:graphicFrameLocks noChangeAspect="1"/>
+            </wp:cNvGraphicFramePr>
+            <a:graphic>
+              <a:graphicData uri="http://schemas.openxmlformats.org/drawingml/2006/picture">
+                <pic:pic>
+                  <pic:nvPicPr>
+                    <pic:cNvPr id="0" name="database-erd.png"/>
+                    <pic:cNvPicPr/>
+                  </pic:nvPicPr>
+                  <pic:blipFill>
+                    <a:blip r:embed="rId12"/>
+                    <a:stretch>
+                      <a:fillRect/>
+                    </a:stretch>
+                  </pic:blipFill>
+                  <pic:spPr>
+                    <a:xfrm>
+                      <a:off x="0" y="0"/>
+                      <a:ext cx="5852160" cy="3214787"/>
+                    </a:xfrm>
+                    <a:prstGeom prst="rect"/>
+                  </pic:spPr>
+                </pic:pic>
+              </a:graphicData>
+            </a:graphic>
+          </wp:inline>
+        </w:drawing>
       </w:r>
     </w:p>
     <w:p>
@@ -3054,7 +3171,108 @@
           <w:color w:val="1B3A6B"/>
           <w:sz w:val="26"/>
         </w:rPr>
+        <w:t>Component view</w:t>
+      </w:r>
+    </w:p>
+    <w:p>
+      <w:pPr>
+        <w:spacing w:after="120"/>
+      </w:pPr>
+      <w:r>
+        <w:t>The fourteen API routers and the services they call. Dashed lines are event</w:t>
+      </w:r>
+    </w:p>
+    <w:p>
+      <w:pPr>
+        <w:spacing w:after="120"/>
+      </w:pPr>
+      <w:r>
+        <w:t>pushes rather than calls:</w:t>
+      </w:r>
+    </w:p>
+    <w:p>
+      <w:r>
+        <w:drawing>
+          <wp:inline xmlns:a="http://schemas.openxmlformats.org/drawingml/2006/main" xmlns:pic="http://schemas.openxmlformats.org/drawingml/2006/picture">
+            <wp:extent cx="5852160" cy="11086496"/>
+            <wp:docPr id="4" name="Picture 4"/>
+            <wp:cNvGraphicFramePr>
+              <a:graphicFrameLocks noChangeAspect="1"/>
+            </wp:cNvGraphicFramePr>
+            <a:graphic>
+              <a:graphicData uri="http://schemas.openxmlformats.org/drawingml/2006/picture">
+                <pic:pic>
+                  <pic:nvPicPr>
+                    <pic:cNvPr id="0" name="diagram-components.png"/>
+                    <pic:cNvPicPr/>
+                  </pic:nvPicPr>
+                  <pic:blipFill>
+                    <a:blip r:embed="rId13"/>
+                    <a:stretch>
+                      <a:fillRect/>
+                    </a:stretch>
+                  </pic:blipFill>
+                  <pic:spPr>
+                    <a:xfrm>
+                      <a:off x="0" y="0"/>
+                      <a:ext cx="5852160" cy="11086496"/>
+                    </a:xfrm>
+                    <a:prstGeom prst="rect"/>
+                  </pic:spPr>
+                </pic:pic>
+              </a:graphicData>
+            </a:graphic>
+          </wp:inline>
+        </w:drawing>
+      </w:r>
+    </w:p>
+    <w:p>
+      <w:pPr>
+        <w:spacing w:before="280"/>
+      </w:pPr>
+      <w:r>
+        <w:rPr>
+          <w:b/>
+          <w:color w:val="1B3A6B"/>
+          <w:sz w:val="26"/>
+        </w:rPr>
         <w:t>Deployment</w:t>
+      </w:r>
+    </w:p>
+    <w:p>
+      <w:r>
+        <w:drawing>
+          <wp:inline xmlns:a="http://schemas.openxmlformats.org/drawingml/2006/main" xmlns:pic="http://schemas.openxmlformats.org/drawingml/2006/picture">
+            <wp:extent cx="5852160" cy="6248648"/>
+            <wp:docPr id="5" name="Picture 5"/>
+            <wp:cNvGraphicFramePr>
+              <a:graphicFrameLocks noChangeAspect="1"/>
+            </wp:cNvGraphicFramePr>
+            <a:graphic>
+              <a:graphicData uri="http://schemas.openxmlformats.org/drawingml/2006/picture">
+                <pic:pic>
+                  <pic:nvPicPr>
+                    <pic:cNvPr id="0" name="diagram-deployment.png"/>
+                    <pic:cNvPicPr/>
+                  </pic:nvPicPr>
+                  <pic:blipFill>
+                    <a:blip r:embed="rId14"/>
+                    <a:stretch>
+                      <a:fillRect/>
+                    </a:stretch>
+                  </pic:blipFill>
+                  <pic:spPr>
+                    <a:xfrm>
+                      <a:off x="0" y="0"/>
+                      <a:ext cx="5852160" cy="6248648"/>
+                    </a:xfrm>
+                    <a:prstGeom prst="rect"/>
+                  </pic:spPr>
+                </pic:pic>
+              </a:graphicData>
+            </a:graphic>
+          </wp:inline>
+        </w:drawing>
       </w:r>
     </w:p>
     <w:p>
@@ -3212,7 +3430,209 @@
         <w:t>frontend_dist/</w:t>
       </w:r>
       <w:r>
-        <w:t>, which FastAPI serves. One image, one container, no nginx.</w:t>
+        <w:t>, which FastAPI serves. One image, one container, no nginx inside</w:t>
+      </w:r>
+    </w:p>
+    <w:p>
+      <w:pPr>
+        <w:spacing w:after="120"/>
+      </w:pPr>
+      <w:r>
+        <w:t>it.</w:t>
+      </w:r>
+    </w:p>
+    <w:p>
+      <w:pPr>
+        <w:spacing w:after="120"/>
+      </w:pPr>
+      <w:r>
+        <w:rPr>
+          <w:b/>
+          <w:color w:val="1B3A6B"/>
+        </w:rPr>
+        <w:t>TLS terminates in front of the container, in Caddy on the host</w:t>
+      </w:r>
+    </w:p>
+    <w:p>
+      <w:pPr>
+        <w:spacing w:after="120"/>
+      </w:pPr>
+      <w:r>
+        <w:t>(</w:t>
+      </w:r>
+      <w:r>
+        <w:rPr>
+          <w:rFonts w:ascii="Courier New" w:hAnsi="Courier New"/>
+          <w:color w:val="1B3A6B"/>
+          <w:sz w:val="18"/>
+        </w:rPr>
+        <w:t>infra/caddy/Caddyfile</w:t>
+      </w:r>
+      <w:r>
+        <w:t xml:space="preserve">, deployed to </w:t>
+      </w:r>
+      <w:r>
+        <w:rPr>
+          <w:rFonts w:ascii="Courier New" w:hAnsi="Courier New"/>
+          <w:color w:val="1B3A6B"/>
+          <w:sz w:val="18"/>
+        </w:rPr>
+        <w:t>/etc/caddy/Caddyfile</w:t>
+      </w:r>
+      <w:r>
+        <w:t>). Caddy holds a real</w:t>
+      </w:r>
+    </w:p>
+    <w:p>
+      <w:pPr>
+        <w:spacing w:after="120"/>
+      </w:pPr>
+      <w:r>
+        <w:t>Let's Encrypt certificate and reverse-proxies to the app container on port 80:</w:t>
+      </w:r>
+    </w:p>
+    <w:p>
+      <w:pPr>
+        <w:shd w:val="clear" w:fill="F4F6F9"/>
+      </w:pPr>
+      <w:r>
+        <w:rPr>
+          <w:rFonts w:ascii="Courier New" w:hAnsi="Courier New"/>
+          <w:sz w:val="16"/>
+        </w:rPr>
+        <w:t>browser --HTTPS--&gt; Caddy (host :443) --HTTP--&gt; app container (:80 -&gt; :8000)</w:t>
+      </w:r>
+    </w:p>
+    <w:p>
+      <w:pPr>
+        <w:spacing w:after="120"/>
+      </w:pPr>
+      <w:r>
+        <w:t>The certificate is obtained without owning a domain by using nip.io wildcard DNS,</w:t>
+      </w:r>
+    </w:p>
+    <w:p>
+      <w:pPr>
+        <w:spacing w:after="120"/>
+      </w:pPr>
+      <w:r>
+        <w:t xml:space="preserve">which resolves </w:t>
+      </w:r>
+      <w:r>
+        <w:rPr>
+          <w:rFonts w:ascii="Courier New" w:hAnsi="Courier New"/>
+          <w:color w:val="1B3A6B"/>
+          <w:sz w:val="18"/>
+        </w:rPr>
+        <w:t>app.20-92-93-30.nip.io</w:t>
+      </w:r>
+      <w:r>
+        <w:t xml:space="preserve"> back to the VM's public IP. Caddy adds</w:t>
+      </w:r>
+    </w:p>
+    <w:p>
+      <w:pPr>
+        <w:spacing w:after="120"/>
+      </w:pPr>
+      <w:r>
+        <w:t xml:space="preserve">HSTS, </w:t>
+      </w:r>
+      <w:r>
+        <w:rPr>
+          <w:rFonts w:ascii="Courier New" w:hAnsi="Courier New"/>
+          <w:color w:val="1B3A6B"/>
+          <w:sz w:val="18"/>
+        </w:rPr>
+        <w:t>X-Content-Type-Options</w:t>
+      </w:r>
+      <w:r>
+        <w:t xml:space="preserve">, </w:t>
+      </w:r>
+      <w:r>
+        <w:rPr>
+          <w:rFonts w:ascii="Courier New" w:hAnsi="Courier New"/>
+          <w:color w:val="1B3A6B"/>
+          <w:sz w:val="18"/>
+        </w:rPr>
+        <w:t>X-Frame-Options</w:t>
+      </w:r>
+      <w:r>
+        <w:t xml:space="preserve"> and a referrer policy, and</w:t>
+      </w:r>
+    </w:p>
+    <w:p>
+      <w:pPr>
+        <w:spacing w:after="120"/>
+      </w:pPr>
+      <w:r>
+        <w:t xml:space="preserve">passes </w:t>
+      </w:r>
+      <w:r>
+        <w:rPr>
+          <w:rFonts w:ascii="Courier New" w:hAnsi="Courier New"/>
+          <w:color w:val="1B3A6B"/>
+          <w:sz w:val="18"/>
+        </w:rPr>
+        <w:t>X-Real-IP</w:t>
+      </w:r>
+      <w:r>
+        <w:t xml:space="preserve"> through so the rate limiter buckets by real client rather than</w:t>
+      </w:r>
+    </w:p>
+    <w:p>
+      <w:pPr>
+        <w:spacing w:after="120"/>
+      </w:pPr>
+      <w:r>
+        <w:t>by whatever the client claims. The app trusts that header only when</w:t>
+      </w:r>
+    </w:p>
+    <w:p>
+      <w:pPr>
+        <w:spacing w:after="120"/>
+      </w:pPr>
+      <w:r>
+        <w:rPr>
+          <w:rFonts w:ascii="Courier New" w:hAnsi="Courier New"/>
+          <w:color w:val="1B3A6B"/>
+          <w:sz w:val="18"/>
+        </w:rPr>
+        <w:t>TRUST_PROXY_HEADER=true</w:t>
+      </w:r>
+      <w:r>
+        <w:t xml:space="preserve"> is set.</w:t>
+      </w:r>
+    </w:p>
+    <w:p>
+      <w:pPr>
+        <w:spacing w:after="120"/>
+      </w:pPr>
+      <w:r>
+        <w:t>The bare-IP HTTP address still answers, because the container publishes port 80</w:t>
+      </w:r>
+    </w:p>
+    <w:p>
+      <w:pPr>
+        <w:spacing w:after="120"/>
+      </w:pPr>
+      <w:r>
+        <w:t>directly, so anything pointed at the old URL keeps working. That is a known</w:t>
+      </w:r>
+    </w:p>
+    <w:p>
+      <w:pPr>
+        <w:spacing w:after="120"/>
+      </w:pPr>
+      <w:r>
+        <w:t>limitation rather than a design choice: a hardened deployment would redirect it</w:t>
+      </w:r>
+    </w:p>
+    <w:p>
+      <w:pPr>
+        <w:spacing w:after="120"/>
+      </w:pPr>
+      <w:r>
+        <w:t>or close it at the network security group.</w:t>
       </w:r>
     </w:p>
     <w:p>

</xml_diff>